<commit_message>
added picture to kirjalik osa.
</commit_message>
<xml_diff>
--- a/Kirjalik osa/Logistika mäng praktiline töö UPT.docx
+++ b/Kirjalik osa/Logistika mäng praktiline töö UPT.docx
@@ -198,8 +198,18 @@
           <w:sz w:val="28"/>
           <w:szCs w:val="28"/>
         </w:rPr>
-        <w:t>Juhendaja: Allar Aav</w:t>
-      </w:r>
+        <w:t xml:space="preserve">Juhendaja: Allar </w:t>
+      </w:r>
+      <w:proofErr w:type="spellStart"/>
+      <w:r>
+        <w:rPr>
+          <w:rFonts w:cs="Times New Roman"/>
+          <w:sz w:val="28"/>
+          <w:szCs w:val="28"/>
+        </w:rPr>
+        <w:t>Aav</w:t>
+      </w:r>
+      <w:proofErr w:type="spellEnd"/>
     </w:p>
     <w:p>
       <w:pPr>
@@ -812,26 +822,9 @@
     </w:p>
     <w:p>
       <w:r>
-        <w:t xml:space="preserve">Ma tahan luua mängu mis sarnaneks teiste </w:t>
-      </w:r>
-      <w:r>
-        <w:t>ressursside haldami</w:t>
-      </w:r>
-      <w:r>
-        <w:t xml:space="preserve">se, </w:t>
-      </w:r>
-      <w:r>
-        <w:t>baasi ehitamise</w:t>
-      </w:r>
-      <w:r>
-        <w:t xml:space="preserve">, </w:t>
-      </w:r>
-      <w:r>
-        <w:t>automaatika</w:t>
-      </w:r>
-      <w:r>
-        <w:t xml:space="preserve"> mängudele, nagu </w:t>
-      </w:r>
+        <w:t xml:space="preserve">Ma tahan luua mängu mis sarnaneks teiste ressursside haldamise, baasi ehitamise, automaatika mängudele, nagu </w:t>
+      </w:r>
+      <w:proofErr w:type="spellStart"/>
       <w:r>
         <w:rPr>
           <w:i/>
@@ -839,95 +832,75 @@
         </w:rPr>
         <w:t>Factorio</w:t>
       </w:r>
+      <w:proofErr w:type="spellEnd"/>
       <w:r>
         <w:t xml:space="preserve">, </w:t>
       </w:r>
+      <w:proofErr w:type="spellStart"/>
       <w:r>
         <w:rPr>
           <w:i/>
           <w:iCs/>
         </w:rPr>
-        <w:t>Dyson Sphere Program</w:t>
-      </w:r>
-      <w:r>
-        <w:t xml:space="preserve"> </w:t>
-      </w:r>
-      <w:r>
-        <w:t xml:space="preserve">ja </w:t>
-      </w:r>
+        <w:t>Dyson</w:t>
+      </w:r>
+      <w:proofErr w:type="spellEnd"/>
       <w:r>
         <w:rPr>
           <w:i/>
           <w:iCs/>
         </w:rPr>
-        <w:t>Satisfactory</w:t>
-      </w:r>
-      <w:r>
-        <w:t xml:space="preserve">. </w:t>
-      </w:r>
-      <w:r>
-        <w:t xml:space="preserve">Nende mängude põhimõte on ehitada tehas või baas mis iseseisvalt täidab mingisugust eesmärki. Valisin sellised </w:t>
-      </w:r>
-      <w:r>
-        <w:t>ž</w:t>
-      </w:r>
-      <w:r>
-        <w:t>anrid oma mängu jaoks kuna need on minu lemmiktüüpi mängud.</w:t>
-      </w:r>
-    </w:p>
-    <w:p>
-      <w:r>
-        <w:t xml:space="preserve">Sellesse žanrisse kuuluvad mängud, nagu </w:t>
-      </w:r>
+        <w:t xml:space="preserve"> </w:t>
+      </w:r>
+      <w:proofErr w:type="spellStart"/>
       <w:r>
         <w:rPr>
           <w:i/>
           <w:iCs/>
         </w:rPr>
-        <w:t>Factorio</w:t>
-      </w:r>
-      <w:r>
-        <w:t xml:space="preserve">, </w:t>
-      </w:r>
+        <w:t>Sphere</w:t>
+      </w:r>
+      <w:proofErr w:type="spellEnd"/>
       <w:r>
         <w:rPr>
           <w:i/>
           <w:iCs/>
         </w:rPr>
-        <w:t>Dyson Sphere Program</w:t>
-      </w:r>
-      <w:r>
-        <w:t xml:space="preserve"> ja </w:t>
-      </w:r>
+        <w:t xml:space="preserve"> </w:t>
+      </w:r>
+      <w:proofErr w:type="spellStart"/>
       <w:r>
         <w:rPr>
           <w:i/>
           <w:iCs/>
         </w:rPr>
-        <w:t>Satisfactory</w:t>
-      </w:r>
-      <w:r>
-        <w:t>, keskenduvad kõik ühele suurele eesmärgile: ehitada toimiv, iseseisev ja üha arenev tootmissüsteem. Mängija alustab tavaliselt väga lihtsatest vahenditest ja piiratud ressurssidest, kuid samm-sammult rajab ta järjest keerukama tehase või tööstusliku baasi, mis suudab automaatselt koguda, töödelda ja transportida materjale. Mängu edenedes kasvab vajadus tõhususe ja optimeerimise järele, mis suunab mängijat pidevalt oma süsteeme täiustama ning looma nutikaid lahendusi, et kõik protsessid toimiksid võimalikult sujuvalt. Lõppeesmärk ei ole ainult ressursside kogumine, vaid kogu tööstusahela selline ülesehitamine, et see töötaks iseseisvalt ja võimalikult efektiivselt, võimaldades mängijal tegeleda üha keerukamate väljakutsetega.</w:t>
-      </w:r>
-      <w:r>
-        <w:br/>
-      </w:r>
-      <w:r>
-        <w:br/>
-      </w:r>
-      <w:r>
-        <w:t xml:space="preserve">Nendes mängudes esineb tavaliselt ka mingi pidurdav element, näiteks kahanevad ressursid, kohalik fauna või maavälised vaenlased. Minu mängus neid konkreetseid elemente ei esine, kuna nende lisamine võtaks palju aega. Teine põhjus, miks ma ei soovi sellist elementi lisada, on mängu fookuse tihendamine. Näiteks </w:t>
-      </w:r>
+        <w:t>Program</w:t>
+      </w:r>
+      <w:proofErr w:type="spellEnd"/>
+      <w:r>
+        <w:t xml:space="preserve"> ja </w:t>
+      </w:r>
+      <w:proofErr w:type="spellStart"/>
       <w:r>
         <w:rPr>
           <w:i/>
           <w:iCs/>
         </w:rPr>
-        <w:t>Factorios</w:t>
-      </w:r>
-      <w:r>
-        <w:t xml:space="preserve"> on mängija vaenlaseks kohalik fauna, mis ründab ja hävitab tehast, lõhkudes masinaid ja peatades tootmisprotsessi. Paljud </w:t>
-      </w:r>
+        <w:t>Satisfactory</w:t>
+      </w:r>
+      <w:proofErr w:type="spellEnd"/>
+      <w:r>
+        <w:t xml:space="preserve">. </w:t>
+      </w:r>
+      <w:r>
+        <w:t>Nende mängude põhimõte on ehitada tehas või baas mis iseseisvalt täidab mingisugust eesmärki. Valisin sellised žanrid oma mängu jaoks kuna need on minu lemmiktüüpi mängud.</w:t>
+      </w:r>
+    </w:p>
+    <w:p>
+      <w:r>
+        <w:t xml:space="preserve">Sellesse žanrisse kuuluvad mängud, nagu </w:t>
+      </w:r>
+      <w:proofErr w:type="spellStart"/>
       <w:r>
         <w:rPr>
           <w:i/>
@@ -935,6 +908,96 @@
         </w:rPr>
         <w:t>Factorio</w:t>
       </w:r>
+      <w:proofErr w:type="spellEnd"/>
+      <w:r>
+        <w:t xml:space="preserve">, </w:t>
+      </w:r>
+      <w:proofErr w:type="spellStart"/>
+      <w:r>
+        <w:rPr>
+          <w:i/>
+          <w:iCs/>
+        </w:rPr>
+        <w:t>Dyson</w:t>
+      </w:r>
+      <w:proofErr w:type="spellEnd"/>
+      <w:r>
+        <w:rPr>
+          <w:i/>
+          <w:iCs/>
+        </w:rPr>
+        <w:t xml:space="preserve"> </w:t>
+      </w:r>
+      <w:proofErr w:type="spellStart"/>
+      <w:r>
+        <w:rPr>
+          <w:i/>
+          <w:iCs/>
+        </w:rPr>
+        <w:t>Sphere</w:t>
+      </w:r>
+      <w:proofErr w:type="spellEnd"/>
+      <w:r>
+        <w:rPr>
+          <w:i/>
+          <w:iCs/>
+        </w:rPr>
+        <w:t xml:space="preserve"> </w:t>
+      </w:r>
+      <w:proofErr w:type="spellStart"/>
+      <w:r>
+        <w:rPr>
+          <w:i/>
+          <w:iCs/>
+        </w:rPr>
+        <w:t>Program</w:t>
+      </w:r>
+      <w:proofErr w:type="spellEnd"/>
+      <w:r>
+        <w:t xml:space="preserve"> ja </w:t>
+      </w:r>
+      <w:proofErr w:type="spellStart"/>
+      <w:r>
+        <w:rPr>
+          <w:i/>
+          <w:iCs/>
+        </w:rPr>
+        <w:t>Satisfactory</w:t>
+      </w:r>
+      <w:proofErr w:type="spellEnd"/>
+      <w:r>
+        <w:t>, keskenduvad kõik ühele suurele eesmärgile: ehitada toimiv, iseseisev ja üha arenev tootmissüsteem. Mängija alustab tavaliselt väga lihtsatest vahenditest ja piiratud ressurssidest, kuid samm-sammult rajab ta järjest keerukama tehase või tööstusliku baasi, mis suudab automaatselt koguda, töödelda ja transportida materjale. Mängu edenedes kasvab vajadus tõhususe ja optimeerimise järele, mis suunab mängijat pidevalt oma süsteeme täiustama ning looma nutikaid lahendusi, et kõik protsessid toimiksid võimalikult sujuvalt. Lõppeesmärk ei ole ainult ressursside kogumine, vaid kogu tööstusahela selline ülesehitamine, et see töötaks iseseisvalt ja võimalikult efektiivselt, võimaldades mängijal tegeleda üha keerukamate väljakutsetega.</w:t>
+      </w:r>
+      <w:r>
+        <w:br/>
+      </w:r>
+      <w:r>
+        <w:br/>
+      </w:r>
+      <w:r>
+        <w:t xml:space="preserve">Nendes mängudes esineb tavaliselt ka mingi pidurdav element, näiteks kahanevad ressursid, kohalik fauna või maavälised vaenlased. Minu mängus neid konkreetseid elemente ei esine, kuna nende lisamine võtaks palju aega. Teine põhjus, miks ma ei soovi sellist elementi lisada, on mängu fookuse tihendamine. Näiteks </w:t>
+      </w:r>
+      <w:proofErr w:type="spellStart"/>
+      <w:r>
+        <w:rPr>
+          <w:i/>
+          <w:iCs/>
+        </w:rPr>
+        <w:t>Factorios</w:t>
+      </w:r>
+      <w:proofErr w:type="spellEnd"/>
+      <w:r>
+        <w:t xml:space="preserve"> on mängija vaenlaseks kohalik fauna, mis ründab ja hävitab tehast, lõhkudes masinaid ja peatades tootmisprotsessi. Paljud </w:t>
+      </w:r>
+      <w:proofErr w:type="spellStart"/>
+      <w:r>
+        <w:rPr>
+          <w:i/>
+          <w:iCs/>
+        </w:rPr>
+        <w:t>Factorio</w:t>
+      </w:r>
+      <w:proofErr w:type="spellEnd"/>
       <w:r>
         <w:t xml:space="preserve"> mängijad lülitavad selle osa mängust välja, sest nad tahavad keskenduda ainult ehitamisele ja probleemide lahendamisele, mis nende tehases esinevad </w:t>
       </w:r>
@@ -973,7 +1036,39 @@
     </w:p>
     <w:p>
       <w:r>
-        <w:t>Kavas oli esitatud kriteerium luua videomäng, mis sarnaneb sama žanri teostele nagu „Factorio“ (2020) ja „Dyson Sphere Program“ (2021).</w:t>
+        <w:t>Kavas oli esitatud kriteerium luua videomäng, mis sarnaneb sama žanri teostele nagu „</w:t>
+      </w:r>
+      <w:proofErr w:type="spellStart"/>
+      <w:r>
+        <w:t>Factorio</w:t>
+      </w:r>
+      <w:proofErr w:type="spellEnd"/>
+      <w:r>
+        <w:t>“ (2020) ja „</w:t>
+      </w:r>
+      <w:proofErr w:type="spellStart"/>
+      <w:r>
+        <w:t>Dyson</w:t>
+      </w:r>
+      <w:proofErr w:type="spellEnd"/>
+      <w:r>
+        <w:t xml:space="preserve"> </w:t>
+      </w:r>
+      <w:proofErr w:type="spellStart"/>
+      <w:r>
+        <w:t>Sphere</w:t>
+      </w:r>
+      <w:proofErr w:type="spellEnd"/>
+      <w:r>
+        <w:t xml:space="preserve"> </w:t>
+      </w:r>
+      <w:proofErr w:type="spellStart"/>
+      <w:r>
+        <w:t>Program</w:t>
+      </w:r>
+      <w:proofErr w:type="spellEnd"/>
+      <w:r>
+        <w:t>“ (2021).</w:t>
       </w:r>
       <w:r>
         <w:br/>
@@ -982,19 +1077,13 @@
     </w:p>
     <w:p>
       <w:r>
-        <w:t xml:space="preserve">Nende mängude keskne eesmärk on rajada omavahel seotud masinatest ja tootmisliinidest koosnev tehas, mis suudab pärast ülesehitamist iseseisvalt toimida ning muuta toorainetest järjest keerukamaid </w:t>
-      </w:r>
-      <w:r>
-        <w:t>l</w:t>
+        <w:t>Nende mängude keskne eesmärk on rajada omavahel seotud masinatest ja tootmisliinidest koosnev tehas, mis suudab pärast ülesehitamist iseseisvalt toimida ning muuta toorainetest järjest keerukamaid l</w:t>
       </w:r>
       <w:r>
         <w:t>õ</w:t>
       </w:r>
       <w:r>
-        <w:t>pp produkte</w:t>
-      </w:r>
-      <w:r>
-        <w:t xml:space="preserve">. Sama põhimõte kehtib ka minu mängus: mängija saab paigutada kaevureid, mis koguvad tooraineid, ning korraldada nende edasi liikumist läbi konveierite ja töötlusmasinate, kuni valmib soovitud </w:t>
+        <w:t xml:space="preserve">pp produkte. Sama põhimõte kehtib ka minu mängus: mängija saab paigutada kaevureid, mis koguvad tooraineid, ning korraldada nende edasi liikumist läbi konveierite ja töötlusmasinate, kuni valmib soovitud </w:t>
       </w:r>
       <w:r>
         <w:t>toode.</w:t>
@@ -1145,8 +1234,13 @@
           </w:tcPr>
           <w:p>
             <w:r>
-              <w:t>Kasutatavus/Mängitavus</w:t>
+              <w:t>Kasutatavus/</w:t>
             </w:r>
+            <w:proofErr w:type="spellStart"/>
+            <w:r>
+              <w:t>Mängitavus</w:t>
+            </w:r>
+            <w:proofErr w:type="spellEnd"/>
           </w:p>
         </w:tc>
         <w:tc>
@@ -1155,7 +1249,15 @@
           </w:tcPr>
           <w:p>
             <w:r>
-              <w:t>Mängus on võimalik teha kõike mis selles leidub kasutades ainult infot mida mängu sees on võimalik leida leida.</w:t>
+              <w:t xml:space="preserve">Mängus on võimalik teha kõike mis selles leidub kasutades ainult infot mida mängu sees on võimalik leida </w:t>
+            </w:r>
+            <w:proofErr w:type="spellStart"/>
+            <w:r>
+              <w:t>leida</w:t>
+            </w:r>
+            <w:proofErr w:type="spellEnd"/>
+            <w:r>
+              <w:t>.</w:t>
             </w:r>
           </w:p>
         </w:tc>
@@ -1367,7 +1469,15 @@
     </w:p>
     <w:p>
       <w:r>
-        <w:t>Godot Engine https://godotengine.org/</w:t>
+        <w:t xml:space="preserve">Godot </w:t>
+      </w:r>
+      <w:proofErr w:type="spellStart"/>
+      <w:r>
+        <w:t>Engine</w:t>
+      </w:r>
+      <w:proofErr w:type="spellEnd"/>
+      <w:r>
+        <w:t xml:space="preserve"> https://godotengine.org/</w:t>
       </w:r>
       <w:r>
         <w:br/>
@@ -1375,8 +1485,13 @@
       </w:r>
     </w:p>
     <w:p>
-      <w:r>
-        <w:t>Github https://github.com/</w:t>
+      <w:proofErr w:type="spellStart"/>
+      <w:r>
+        <w:t>Github</w:t>
+      </w:r>
+      <w:proofErr w:type="spellEnd"/>
+      <w:r>
+        <w:t xml:space="preserve"> https://github.com/</w:t>
       </w:r>
       <w:r>
         <w:br/>
@@ -1384,8 +1499,13 @@
       </w:r>
     </w:p>
     <w:p>
-      <w:r>
-        <w:t>Blender https://www.blender.org/</w:t>
+      <w:proofErr w:type="spellStart"/>
+      <w:r>
+        <w:t>Blender</w:t>
+      </w:r>
+      <w:proofErr w:type="spellEnd"/>
+      <w:r>
+        <w:t xml:space="preserve"> https://www.blender.org/</w:t>
       </w:r>
       <w:r>
         <w:br/>
@@ -1413,9 +1533,11 @@
       <w:r>
         <w:t xml:space="preserve">Godot </w:t>
       </w:r>
+      <w:proofErr w:type="spellStart"/>
       <w:r>
         <w:t>Engine</w:t>
       </w:r>
+      <w:proofErr w:type="spellEnd"/>
       <w:r>
         <w:t xml:space="preserve"> dokumentatsioon https://docs.godotengine.org/en/stable/</w:t>
       </w:r>
@@ -1437,15 +1559,111 @@
       </w:r>
     </w:p>
     <w:p>
-      <w:r>
-        <w:t>Factorio arendajate blogi https://www.factorio.com/blog/</w:t>
+      <w:proofErr w:type="spellStart"/>
+      <w:r>
+        <w:t>Factorio</w:t>
+      </w:r>
+      <w:proofErr w:type="spellEnd"/>
+      <w:r>
+        <w:t xml:space="preserve"> arendajate blogi https://www.factorio.com/blog/</w:t>
       </w:r>
       <w:r>
         <w:br/>
         <w:t>Väga kasulik allikas minu mängu jaoks.</w:t>
       </w:r>
       <w:r>
-        <w:t xml:space="preserve"> Seal on räägitud kuidas Factorio arendajad mõningaid probleeme mängu tegemisel lahendasid.</w:t>
+        <w:t xml:space="preserve"> Seal on räägitud kuidas </w:t>
+      </w:r>
+      <w:proofErr w:type="spellStart"/>
+      <w:r>
+        <w:t>Factorio</w:t>
+      </w:r>
+      <w:proofErr w:type="spellEnd"/>
+      <w:r>
+        <w:t xml:space="preserve"> arendajad mõningaid probleeme mängu tegemisel lahendasid.</w:t>
+      </w:r>
+    </w:p>
+    <w:p>
+      <w:r>
+        <w:br w:type="page"/>
+      </w:r>
+    </w:p>
+    <w:p>
+      <w:pPr>
+        <w:pStyle w:val="Heading1"/>
+      </w:pPr>
+      <w:r>
+        <w:lastRenderedPageBreak/>
+        <w:t>LISAD</w:t>
+      </w:r>
+    </w:p>
+    <w:p>
+      <w:r>
+        <w:t xml:space="preserve">Lisa 1: </w:t>
+      </w:r>
+      <w:r>
+        <w:t xml:space="preserve">Kuvatõmmis mängust </w:t>
+      </w:r>
+      <w:r>
+        <w:t>16/10/2025</w:t>
+      </w:r>
+      <w:r>
+        <w:t>, Sellel versioonil oli esimene eesmärk ning ajalugemine lisatud. On näha tehast mis on loodud esimese eesmärgi saavutamiseks.</w:t>
+      </w:r>
+    </w:p>
+    <w:p>
+      <w:r>
+        <w:rPr>
+          <w:noProof/>
+        </w:rPr>
+        <w:drawing>
+          <wp:inline distT="0" distB="0" distL="0" distR="0" wp14:anchorId="6B51AF05" wp14:editId="3259A10F">
+            <wp:extent cx="5722620" cy="3225165"/>
+            <wp:effectExtent l="0" t="0" r="0" b="0"/>
+            <wp:docPr id="20837941" name="Picture 1"/>
+            <wp:cNvGraphicFramePr>
+              <a:graphicFrameLocks xmlns:a="http://schemas.openxmlformats.org/drawingml/2006/main" noChangeAspect="1"/>
+            </wp:cNvGraphicFramePr>
+            <a:graphic xmlns:a="http://schemas.openxmlformats.org/drawingml/2006/main">
+              <a:graphicData uri="http://schemas.openxmlformats.org/drawingml/2006/picture">
+                <pic:pic xmlns:pic="http://schemas.openxmlformats.org/drawingml/2006/picture">
+                  <pic:nvPicPr>
+                    <pic:cNvPr id="0" name="Picture 1"/>
+                    <pic:cNvPicPr>
+                      <a:picLocks noChangeAspect="1" noChangeArrowheads="1"/>
+                    </pic:cNvPicPr>
+                  </pic:nvPicPr>
+                  <pic:blipFill>
+                    <a:blip r:embed="rId5" cstate="print">
+                      <a:extLst>
+                        <a:ext uri="{28A0092B-C50C-407E-A947-70E740481C1C}">
+                          <a14:useLocalDpi xmlns:a14="http://schemas.microsoft.com/office/drawing/2010/main" val="0"/>
+                        </a:ext>
+                      </a:extLst>
+                    </a:blip>
+                    <a:srcRect/>
+                    <a:stretch>
+                      <a:fillRect/>
+                    </a:stretch>
+                  </pic:blipFill>
+                  <pic:spPr bwMode="auto">
+                    <a:xfrm>
+                      <a:off x="0" y="0"/>
+                      <a:ext cx="5722620" cy="3225165"/>
+                    </a:xfrm>
+                    <a:prstGeom prst="rect">
+                      <a:avLst/>
+                    </a:prstGeom>
+                    <a:noFill/>
+                    <a:ln>
+                      <a:noFill/>
+                    </a:ln>
+                  </pic:spPr>
+                </pic:pic>
+              </a:graphicData>
+            </a:graphic>
+          </wp:inline>
+        </w:drawing>
       </w:r>
     </w:p>
     <w:sectPr>
@@ -2064,6 +2282,7 @@
   <w:style w:type="character" w:default="1" w:styleId="DefaultParagraphFont">
     <w:name w:val="Default Paragraph Font"/>
     <w:uiPriority w:val="1"/>
+    <w:semiHidden/>
     <w:unhideWhenUsed/>
   </w:style>
   <w:style w:type="table" w:default="1" w:styleId="TableNormal">

</xml_diff>

<commit_message>
kirjalik whatever + lang fix
</commit_message>
<xml_diff>
--- a/Kirjalik osa/Logistika mäng praktiline töö UPT.docx
+++ b/Kirjalik osa/Logistika mäng praktiline töö UPT.docx
@@ -198,18 +198,8 @@
           <w:sz w:val="28"/>
           <w:szCs w:val="28"/>
         </w:rPr>
-        <w:t xml:space="preserve">Juhendaja: Allar </w:t>
-      </w:r>
-      <w:proofErr w:type="spellStart"/>
-      <w:r>
-        <w:rPr>
-          <w:rFonts w:cs="Times New Roman"/>
-          <w:sz w:val="28"/>
-          <w:szCs w:val="28"/>
-        </w:rPr>
-        <w:t>Aav</w:t>
-      </w:r>
-      <w:proofErr w:type="spellEnd"/>
+        <w:t>Juhendaja: Allar Aav</w:t>
+      </w:r>
     </w:p>
     <w:p>
       <w:pPr>
@@ -824,7 +814,6 @@
       <w:r>
         <w:t xml:space="preserve">Ma tahan luua mängu mis sarnaneks teiste ressursside haldamise, baasi ehitamise, automaatika mängudele, nagu </w:t>
       </w:r>
-      <w:proofErr w:type="spellStart"/>
       <w:r>
         <w:rPr>
           <w:i/>
@@ -832,75 +821,86 @@
         </w:rPr>
         <w:t>Factorio</w:t>
       </w:r>
-      <w:proofErr w:type="spellEnd"/>
       <w:r>
         <w:t xml:space="preserve">, </w:t>
       </w:r>
-      <w:proofErr w:type="spellStart"/>
       <w:r>
         <w:rPr>
           <w:i/>
           <w:iCs/>
         </w:rPr>
-        <w:t>Dyson</w:t>
-      </w:r>
-      <w:proofErr w:type="spellEnd"/>
+        <w:t>Dyson Sphere Program</w:t>
+      </w:r>
+      <w:r>
+        <w:t xml:space="preserve"> ja </w:t>
+      </w:r>
       <w:r>
         <w:rPr>
           <w:i/>
           <w:iCs/>
         </w:rPr>
-        <w:t xml:space="preserve"> </w:t>
-      </w:r>
-      <w:proofErr w:type="spellStart"/>
+        <w:t>Satisfactory</w:t>
+      </w:r>
+      <w:r>
+        <w:t xml:space="preserve">. </w:t>
+      </w:r>
+      <w:r>
+        <w:t>Nende mängude põhimõte on ehitada tehas või baas mis iseseisvalt täidab mingisugust eesmärki. Valisin sellised žanrid oma mängu jaoks kuna need on minu lemmiktüüpi mängud.</w:t>
+      </w:r>
+    </w:p>
+    <w:p>
+      <w:r>
+        <w:t xml:space="preserve">Sellesse žanrisse kuuluvad mängud, nagu </w:t>
+      </w:r>
       <w:r>
         <w:rPr>
           <w:i/>
           <w:iCs/>
         </w:rPr>
-        <w:t>Sphere</w:t>
-      </w:r>
-      <w:proofErr w:type="spellEnd"/>
+        <w:t>Factorio</w:t>
+      </w:r>
+      <w:r>
+        <w:t xml:space="preserve">, </w:t>
+      </w:r>
       <w:r>
         <w:rPr>
           <w:i/>
           <w:iCs/>
         </w:rPr>
-        <w:t xml:space="preserve"> </w:t>
-      </w:r>
-      <w:proofErr w:type="spellStart"/>
+        <w:t>Dyson Sphere Program</w:t>
+      </w:r>
+      <w:r>
+        <w:t xml:space="preserve"> ja </w:t>
+      </w:r>
       <w:r>
         <w:rPr>
           <w:i/>
           <w:iCs/>
         </w:rPr>
-        <w:t>Program</w:t>
-      </w:r>
-      <w:proofErr w:type="spellEnd"/>
-      <w:r>
-        <w:t xml:space="preserve"> ja </w:t>
-      </w:r>
-      <w:proofErr w:type="spellStart"/>
+        <w:t>Satisfactory</w:t>
+      </w:r>
+      <w:r>
+        <w:t>, keskenduvad kõik ühele suurele eesmärgile: ehitada toimiv, iseseisev ja üha arenev tootmissüsteem. Mängija alustab tavaliselt väga lihtsatest vahenditest ja piiratud ressurssidest, kuid samm-sammult rajab ta järjest keerukama tehase või tööstusliku baasi, mis suudab automaatselt koguda, töödelda ja transportida materjale. Mängu edenedes kasvab vajadus tõhususe ja optimeerimise järele, mis suunab mängijat pidevalt oma süsteeme täiustama ning looma nutikaid lahendusi, et kõik protsessid toimiksid võimalikult sujuvalt. Lõppeesmärk ei ole ainult ressursside kogumine, vaid kogu tööstusahela selline ülesehitamine, et see töötaks iseseisvalt ja võimalikult efektiivselt, võimaldades mängijal tegeleda üha keerukamate väljakutsetega.</w:t>
+      </w:r>
+      <w:r>
+        <w:br/>
+      </w:r>
+      <w:r>
+        <w:br/>
+      </w:r>
+      <w:r>
+        <w:t xml:space="preserve">Nendes mängudes esineb tavaliselt ka mingi pidurdav element, näiteks kahanevad ressursid, kohalik fauna või maavälised vaenlased. Minu mängus neid konkreetseid elemente ei esine, kuna nende lisamine võtaks palju aega. Teine põhjus, miks ma ei soovi sellist elementi lisada, on mängu fookuse tihendamine. Näiteks </w:t>
+      </w:r>
       <w:r>
         <w:rPr>
           <w:i/>
           <w:iCs/>
         </w:rPr>
-        <w:t>Satisfactory</w:t>
-      </w:r>
-      <w:proofErr w:type="spellEnd"/>
-      <w:r>
-        <w:t xml:space="preserve">. </w:t>
-      </w:r>
-      <w:r>
-        <w:t>Nende mängude põhimõte on ehitada tehas või baas mis iseseisvalt täidab mingisugust eesmärki. Valisin sellised žanrid oma mängu jaoks kuna need on minu lemmiktüüpi mängud.</w:t>
-      </w:r>
-    </w:p>
-    <w:p>
-      <w:r>
-        <w:t xml:space="preserve">Sellesse žanrisse kuuluvad mängud, nagu </w:t>
-      </w:r>
-      <w:proofErr w:type="spellStart"/>
+        <w:t>Factorios</w:t>
+      </w:r>
+      <w:r>
+        <w:t xml:space="preserve"> on mängija vaenlaseks kohalik fauna, mis ründab ja hävitab tehast, lõhkudes masinaid ja peatades tootmisprotsessi. Paljud </w:t>
+      </w:r>
       <w:r>
         <w:rPr>
           <w:i/>
@@ -908,96 +908,6 @@
         </w:rPr>
         <w:t>Factorio</w:t>
       </w:r>
-      <w:proofErr w:type="spellEnd"/>
-      <w:r>
-        <w:t xml:space="preserve">, </w:t>
-      </w:r>
-      <w:proofErr w:type="spellStart"/>
-      <w:r>
-        <w:rPr>
-          <w:i/>
-          <w:iCs/>
-        </w:rPr>
-        <w:t>Dyson</w:t>
-      </w:r>
-      <w:proofErr w:type="spellEnd"/>
-      <w:r>
-        <w:rPr>
-          <w:i/>
-          <w:iCs/>
-        </w:rPr>
-        <w:t xml:space="preserve"> </w:t>
-      </w:r>
-      <w:proofErr w:type="spellStart"/>
-      <w:r>
-        <w:rPr>
-          <w:i/>
-          <w:iCs/>
-        </w:rPr>
-        <w:t>Sphere</w:t>
-      </w:r>
-      <w:proofErr w:type="spellEnd"/>
-      <w:r>
-        <w:rPr>
-          <w:i/>
-          <w:iCs/>
-        </w:rPr>
-        <w:t xml:space="preserve"> </w:t>
-      </w:r>
-      <w:proofErr w:type="spellStart"/>
-      <w:r>
-        <w:rPr>
-          <w:i/>
-          <w:iCs/>
-        </w:rPr>
-        <w:t>Program</w:t>
-      </w:r>
-      <w:proofErr w:type="spellEnd"/>
-      <w:r>
-        <w:t xml:space="preserve"> ja </w:t>
-      </w:r>
-      <w:proofErr w:type="spellStart"/>
-      <w:r>
-        <w:rPr>
-          <w:i/>
-          <w:iCs/>
-        </w:rPr>
-        <w:t>Satisfactory</w:t>
-      </w:r>
-      <w:proofErr w:type="spellEnd"/>
-      <w:r>
-        <w:t>, keskenduvad kõik ühele suurele eesmärgile: ehitada toimiv, iseseisev ja üha arenev tootmissüsteem. Mängija alustab tavaliselt väga lihtsatest vahenditest ja piiratud ressurssidest, kuid samm-sammult rajab ta järjest keerukama tehase või tööstusliku baasi, mis suudab automaatselt koguda, töödelda ja transportida materjale. Mängu edenedes kasvab vajadus tõhususe ja optimeerimise järele, mis suunab mängijat pidevalt oma süsteeme täiustama ning looma nutikaid lahendusi, et kõik protsessid toimiksid võimalikult sujuvalt. Lõppeesmärk ei ole ainult ressursside kogumine, vaid kogu tööstusahela selline ülesehitamine, et see töötaks iseseisvalt ja võimalikult efektiivselt, võimaldades mängijal tegeleda üha keerukamate väljakutsetega.</w:t>
-      </w:r>
-      <w:r>
-        <w:br/>
-      </w:r>
-      <w:r>
-        <w:br/>
-      </w:r>
-      <w:r>
-        <w:t xml:space="preserve">Nendes mängudes esineb tavaliselt ka mingi pidurdav element, näiteks kahanevad ressursid, kohalik fauna või maavälised vaenlased. Minu mängus neid konkreetseid elemente ei esine, kuna nende lisamine võtaks palju aega. Teine põhjus, miks ma ei soovi sellist elementi lisada, on mängu fookuse tihendamine. Näiteks </w:t>
-      </w:r>
-      <w:proofErr w:type="spellStart"/>
-      <w:r>
-        <w:rPr>
-          <w:i/>
-          <w:iCs/>
-        </w:rPr>
-        <w:t>Factorios</w:t>
-      </w:r>
-      <w:proofErr w:type="spellEnd"/>
-      <w:r>
-        <w:t xml:space="preserve"> on mängija vaenlaseks kohalik fauna, mis ründab ja hävitab tehast, lõhkudes masinaid ja peatades tootmisprotsessi. Paljud </w:t>
-      </w:r>
-      <w:proofErr w:type="spellStart"/>
-      <w:r>
-        <w:rPr>
-          <w:i/>
-          <w:iCs/>
-        </w:rPr>
-        <w:t>Factorio</w:t>
-      </w:r>
-      <w:proofErr w:type="spellEnd"/>
       <w:r>
         <w:t xml:space="preserve"> mängijad lülitavad selle osa mängust välja, sest nad tahavad keskenduda ainult ehitamisele ja probleemide lahendamisele, mis nende tehases esinevad </w:t>
       </w:r>
@@ -1036,39 +946,7 @@
     </w:p>
     <w:p>
       <w:r>
-        <w:t>Kavas oli esitatud kriteerium luua videomäng, mis sarnaneb sama žanri teostele nagu „</w:t>
-      </w:r>
-      <w:proofErr w:type="spellStart"/>
-      <w:r>
-        <w:t>Factorio</w:t>
-      </w:r>
-      <w:proofErr w:type="spellEnd"/>
-      <w:r>
-        <w:t>“ (2020) ja „</w:t>
-      </w:r>
-      <w:proofErr w:type="spellStart"/>
-      <w:r>
-        <w:t>Dyson</w:t>
-      </w:r>
-      <w:proofErr w:type="spellEnd"/>
-      <w:r>
-        <w:t xml:space="preserve"> </w:t>
-      </w:r>
-      <w:proofErr w:type="spellStart"/>
-      <w:r>
-        <w:t>Sphere</w:t>
-      </w:r>
-      <w:proofErr w:type="spellEnd"/>
-      <w:r>
-        <w:t xml:space="preserve"> </w:t>
-      </w:r>
-      <w:proofErr w:type="spellStart"/>
-      <w:r>
-        <w:t>Program</w:t>
-      </w:r>
-      <w:proofErr w:type="spellEnd"/>
-      <w:r>
-        <w:t>“ (2021).</w:t>
+        <w:t>Kavas oli esitatud kriteerium luua videomäng, mis sarnaneb sama žanri teostele nagu „Factorio“ (2020) ja „Dyson Sphere Program“ (2021).</w:t>
       </w:r>
       <w:r>
         <w:br/>
@@ -1234,13 +1112,8 @@
           </w:tcPr>
           <w:p>
             <w:r>
-              <w:t>Kasutatavus/</w:t>
+              <w:t>Kasutatavus/Mängitavus</w:t>
             </w:r>
-            <w:proofErr w:type="spellStart"/>
-            <w:r>
-              <w:t>Mängitavus</w:t>
-            </w:r>
-            <w:proofErr w:type="spellEnd"/>
           </w:p>
         </w:tc>
         <w:tc>
@@ -1249,15 +1122,7 @@
           </w:tcPr>
           <w:p>
             <w:r>
-              <w:t xml:space="preserve">Mängus on võimalik teha kõike mis selles leidub kasutades ainult infot mida mängu sees on võimalik leida </w:t>
-            </w:r>
-            <w:proofErr w:type="spellStart"/>
-            <w:r>
-              <w:t>leida</w:t>
-            </w:r>
-            <w:proofErr w:type="spellEnd"/>
-            <w:r>
-              <w:t>.</w:t>
+              <w:t>Mängus on võimalik teha kõike mis selles leidub kasutades ainult infot mida mängu sees on võimalik leida leida.</w:t>
             </w:r>
           </w:p>
         </w:tc>
@@ -1469,15 +1334,7 @@
     </w:p>
     <w:p>
       <w:r>
-        <w:t xml:space="preserve">Godot </w:t>
-      </w:r>
-      <w:proofErr w:type="spellStart"/>
-      <w:r>
-        <w:t>Engine</w:t>
-      </w:r>
-      <w:proofErr w:type="spellEnd"/>
-      <w:r>
-        <w:t xml:space="preserve"> https://godotengine.org/</w:t>
+        <w:t>Godot Engine https://godotengine.org/</w:t>
       </w:r>
       <w:r>
         <w:br/>
@@ -1485,13 +1342,8 @@
       </w:r>
     </w:p>
     <w:p>
-      <w:proofErr w:type="spellStart"/>
-      <w:r>
-        <w:t>Github</w:t>
-      </w:r>
-      <w:proofErr w:type="spellEnd"/>
-      <w:r>
-        <w:t xml:space="preserve"> https://github.com/</w:t>
+      <w:r>
+        <w:t>Github https://github.com/</w:t>
       </w:r>
       <w:r>
         <w:br/>
@@ -1499,13 +1351,8 @@
       </w:r>
     </w:p>
     <w:p>
-      <w:proofErr w:type="spellStart"/>
-      <w:r>
-        <w:t>Blender</w:t>
-      </w:r>
-      <w:proofErr w:type="spellEnd"/>
-      <w:r>
-        <w:t xml:space="preserve"> https://www.blender.org/</w:t>
+      <w:r>
+        <w:t>Blender https://www.blender.org/</w:t>
       </w:r>
       <w:r>
         <w:br/>
@@ -1533,11 +1380,9 @@
       <w:r>
         <w:t xml:space="preserve">Godot </w:t>
       </w:r>
-      <w:proofErr w:type="spellStart"/>
       <w:r>
         <w:t>Engine</w:t>
       </w:r>
-      <w:proofErr w:type="spellEnd"/>
       <w:r>
         <w:t xml:space="preserve"> dokumentatsioon https://docs.godotengine.org/en/stable/</w:t>
       </w:r>
@@ -1559,30 +1404,57 @@
       </w:r>
     </w:p>
     <w:p>
-      <w:proofErr w:type="spellStart"/>
-      <w:r>
-        <w:t>Factorio</w:t>
-      </w:r>
-      <w:proofErr w:type="spellEnd"/>
-      <w:r>
-        <w:t xml:space="preserve"> arendajate blogi https://www.factorio.com/blog/</w:t>
+      <w:r>
+        <w:t>Factorio arendajate blogi https://www.factorio.com/blog/</w:t>
       </w:r>
       <w:r>
         <w:br/>
         <w:t>Väga kasulik allikas minu mängu jaoks.</w:t>
       </w:r>
       <w:r>
-        <w:t xml:space="preserve"> Seal on räägitud kuidas </w:t>
-      </w:r>
-      <w:proofErr w:type="spellStart"/>
-      <w:r>
-        <w:t>Factorio</w:t>
-      </w:r>
-      <w:proofErr w:type="spellEnd"/>
-      <w:r>
-        <w:t xml:space="preserve"> arendajad mõningaid probleeme mängu tegemisel lahendasid.</w:t>
-      </w:r>
-    </w:p>
+        <w:t xml:space="preserve"> Seal on räägitud kuidas Factorio arendajad mõningaid probleeme mängu tegemisel lahendasid.</w:t>
+      </w:r>
+    </w:p>
+    <w:p>
+      <w:r>
+        <w:t>Mängu tegemist alustasin Godot projekti ning Githubi hoidla loomisega. Godot kasutan mängu enda tegemiseks. Githubi laen üles mängu uuendused ja erinevad versioonid, et oleks olemas tagavara koht kus õnnetuse korral saab versiooni tagasi keerata, seal on ka mugav üles laadida valmis mängitavaid versioone mida on ka lihtne avalikult jagada.</w:t>
+      </w:r>
+    </w:p>
+    <w:p>
+      <w:r>
+        <w:t>Ideed minu mängu jaoks tulid tavaliselt peale minu inspiratsiooni Factorio mängimist või selle arendajate blogi lugemist. Näiteks enne kui mu mängul oli lõpp</w:t>
+      </w:r>
+      <w:r>
+        <w:t xml:space="preserve"> </w:t>
+      </w:r>
+      <w:r>
+        <w:t>eesmärk arvasin et mäng oli lõpuks selle jaoks valmis, kuid pärast Factorio mängimist ja enda mänguga võrdlemist sain aru</w:t>
+      </w:r>
+      <w:r>
+        <w:t>,</w:t>
+      </w:r>
+      <w:r>
+        <w:t xml:space="preserve"> et mul on puudu </w:t>
+      </w:r>
+      <w:r>
+        <w:t>ehitis mis jagab ühe konveieri mitmeks, mis on väga kasulik kuna sellega saab toita mitmeid ehitisi sama konveieriga</w:t>
+      </w:r>
+      <w:r>
+        <w:t>.</w:t>
+      </w:r>
+    </w:p>
+    <w:p/>
+    <w:p>
+      <w:r>
+        <w:lastRenderedPageBreak/>
+        <w:t>What game got in it</w:t>
+      </w:r>
+      <w:r>
+        <w:br/>
+        <w:t>plan? Plan??? Plan??????????</w:t>
+      </w:r>
+    </w:p>
+    <w:p/>
     <w:p>
       <w:r>
         <w:br w:type="page"/>

</xml_diff>